<commit_message>
Updating the Code rubric with Implicit String Literal Concatenation:
</commit_message>
<xml_diff>
--- a/docs/CodeEvaluationRubric-DesignGuidelines.docx
+++ b/docs/CodeEvaluationRubric-DesignGuidelines.docx
@@ -4577,12 +4577,169 @@
           <w:numId w:val="7"/>
         </w:numPr>
         <w:ind w:left="720" w:hanging="360"/>
-      </w:pPr>
-      <w:r>
-        <w:rPr>
-          <w:rtl w:val="0"/>
-        </w:rPr>
-        <w:t xml:space="preserve">Avoid unnecessary f-strings: do not prefix a string with f unless it contains an interpolation ({...}); remove the f after refactors that eliminate formatted expressions.</w:t>
+        <w:rPr>
+          <w:u w:val="none"/>
+        </w:rPr>
+      </w:pPr>
+      <w:r>
+        <w:rPr>
+          <w:rtl w:val="0"/>
+        </w:rPr>
+        <w:t xml:space="preserve">String Formatting:</w:t>
+      </w:r>
+    </w:p>
+    <w:p>
+      <w:pPr>
+        <w:numPr>
+          <w:ilvl w:val="1"/>
+          <w:numId w:val="7"/>
+        </w:numPr>
+        <w:ind w:left="1440" w:hanging="360"/>
+        <w:rPr>
+          <w:u w:val="none"/>
+        </w:rPr>
+      </w:pPr>
+      <w:r>
+        <w:rPr>
+          <w:rtl w:val="0"/>
+        </w:rPr>
+        <w:t xml:space="preserve">Implicit String Literal Concatenation:</w:t>
+      </w:r>
+    </w:p>
+    <w:p>
+      <w:pPr>
+        <w:numPr>
+          <w:ilvl w:val="2"/>
+          <w:numId w:val="7"/>
+        </w:numPr>
+        <w:ind w:left="2160" w:hanging="360"/>
+      </w:pPr>
+      <w:r>
+        <w:rPr>
+          <w:rtl w:val="0"/>
+        </w:rPr>
+        <w:t xml:space="preserve">Use implicit string literal concatenation (adjacent string literals within parentheses) when:</w:t>
+      </w:r>
+    </w:p>
+    <w:p>
+      <w:pPr>
+        <w:numPr>
+          <w:ilvl w:val="3"/>
+          <w:numId w:val="7"/>
+        </w:numPr>
+        <w:ind w:left="2880" w:hanging="360"/>
+      </w:pPr>
+      <w:r>
+        <w:rPr>
+          <w:rFonts w:ascii="Arial Unicode MS" w:cs="Arial Unicode MS" w:eastAsia="Arial Unicode MS" w:hAnsi="Arial Unicode MS"/>
+          <w:rtl w:val="0"/>
+        </w:rPr>
+        <w:t xml:space="preserve">Formatting involves multiple semantic segments (e.g., style → value → delimiter → reset).</w:t>
+      </w:r>
+    </w:p>
+    <w:p>
+      <w:pPr>
+        <w:numPr>
+          <w:ilvl w:val="3"/>
+          <w:numId w:val="7"/>
+        </w:numPr>
+        <w:ind w:left="2880" w:hanging="360"/>
+      </w:pPr>
+      <w:r>
+        <w:rPr>
+          <w:rtl w:val="0"/>
+        </w:rPr>
+        <w:t xml:space="preserve">ANSI/SGR styling or other visual formatting increases horizontal density.</w:t>
+      </w:r>
+    </w:p>
+    <w:p>
+      <w:pPr>
+        <w:numPr>
+          <w:ilvl w:val="3"/>
+          <w:numId w:val="7"/>
+        </w:numPr>
+        <w:ind w:left="2880" w:hanging="360"/>
+      </w:pPr>
+      <w:r>
+        <w:rPr>
+          <w:rtl w:val="0"/>
+        </w:rPr>
+        <w:t xml:space="preserve">Multi-line structure improves readability.</w:t>
+      </w:r>
+    </w:p>
+    <w:p>
+      <w:pPr>
+        <w:numPr>
+          <w:ilvl w:val="2"/>
+          <w:numId w:val="7"/>
+        </w:numPr>
+        <w:ind w:left="2160" w:hanging="360"/>
+      </w:pPr>
+      <w:r>
+        <w:rPr>
+          <w:rtl w:val="0"/>
+        </w:rPr>
+        <w:t xml:space="preserve">Avoid implicit concatenation when:</w:t>
+      </w:r>
+    </w:p>
+    <w:p>
+      <w:pPr>
+        <w:numPr>
+          <w:ilvl w:val="3"/>
+          <w:numId w:val="7"/>
+        </w:numPr>
+        <w:ind w:left="2880" w:hanging="360"/>
+      </w:pPr>
+      <w:r>
+        <w:rPr>
+          <w:rtl w:val="0"/>
+        </w:rPr>
+        <w:t xml:space="preserve">Formatting is trivial (e.g., a single formatted value and literal).</w:t>
+      </w:r>
+    </w:p>
+    <w:p>
+      <w:pPr>
+        <w:numPr>
+          <w:ilvl w:val="3"/>
+          <w:numId w:val="7"/>
+        </w:numPr>
+        <w:ind w:left="2880" w:hanging="360"/>
+      </w:pPr>
+      <w:r>
+        <w:rPr>
+          <w:rtl w:val="0"/>
+        </w:rPr>
+        <w:t xml:space="preserve">The resulting structure would be less readable than a single f-string.</w:t>
+      </w:r>
+    </w:p>
+    <w:p>
+      <w:pPr>
+        <w:numPr>
+          <w:ilvl w:val="2"/>
+          <w:numId w:val="7"/>
+        </w:numPr>
+        <w:ind w:left="2160" w:hanging="360"/>
+      </w:pPr>
+      <w:r>
+        <w:rPr>
+          <w:rtl w:val="0"/>
+        </w:rPr>
+        <w:t xml:space="preserve">Never mix implicitly concatenated strings with commas unless tuple construction is intentional.</w:t>
+      </w:r>
+    </w:p>
+    <w:p>
+      <w:pPr>
+        <w:numPr>
+          <w:ilvl w:val="1"/>
+          <w:numId w:val="7"/>
+        </w:numPr>
+        <w:ind w:left="1440" w:hanging="360"/>
+      </w:pPr>
+      <w:r>
+        <w:rPr>
+          <w:rtl w:val="0"/>
+        </w:rPr>
+        <w:t xml:space="preserve">Avoid unnecessary f-strings: prefix a string with f only when it contains an interpolation ({...}). Remove the f after refactors that eliminate formatted expressions.</w:t>
       </w:r>
     </w:p>
     <w:sectPr>

</xml_diff>